<commit_message>
feat: atualiza indicacoes de cesarea (Indicacao_final) e forcipe, regera figuras e tabelas
</commit_message>
<xml_diff>
--- a/manuscript/REVISAO_DISSERTACAO_OR_PR.docx
+++ b/manuscript/REVISAO_DISSERTACAO_OR_PR.docx
@@ -6860,6 +6860,2146 @@
         </w:tc>
       </w:tr>
     </w:tbl>
+    <w:p>
+      <w:r>
+        <w:pict>
+          <v:rect style="width:0;height:1.5pt" o:hralign="center" o:hrstd="t" o:hr="t"/>
+        </w:pict>
+      </w:r>
+    </w:p>
+    <w:p>
+      <w:pPr>
+        <w:pStyle w:val="Heading2"/>
+      </w:pPr>
+      <w:bookmarkStart w:id="44" w:name="Xf9cedb9dbfc86692616350217ade293bf591d68"/>
+      <w:r>
+        <w:t xml:space="preserve">8. Seção 5.4 — Indicações de parto operatório (atualização dos dados)</w:t>
+      </w:r>
+      <w:bookmarkEnd w:id="44"/>
+    </w:p>
+    <w:p>
+      <w:pPr>
+        <w:pStyle w:val="FirstParagraph"/>
+      </w:pPr>
+      <w:r>
+        <w:rPr>
+          <w:b/>
+        </w:rPr>
+        <w:t xml:space="preserve">O que mudou e por quê.</w:t>
+      </w:r>
+      <w:r>
+        <w:t xml:space="preserve"> </w:t>
+      </w:r>
+      <w:r>
+        <w:t xml:space="preserve">As indicações de</w:t>
+      </w:r>
+      <w:r>
+        <w:t xml:space="preserve"> </w:t>
+      </w:r>
+      <w:r>
+        <w:rPr>
+          <w:b/>
+        </w:rPr>
+        <w:t xml:space="preserve">cesárea</w:t>
+      </w:r>
+      <w:r>
+        <w:t xml:space="preserve"> </w:t>
+      </w:r>
+      <w:r>
+        <w:t xml:space="preserve">passaram a ser agrupadas pela</w:t>
+      </w:r>
+      <w:r>
+        <w:t xml:space="preserve"> </w:t>
+      </w:r>
+      <w:r>
+        <w:t xml:space="preserve">variável hierárquica</w:t>
+      </w:r>
+      <w:r>
+        <w:t xml:space="preserve"> </w:t>
+      </w:r>
+      <w:r>
+        <w:rPr>
+          <w:rStyle w:val="VerbatimChar"/>
+          <w:b/>
+        </w:rPr>
+        <w:t xml:space="preserve">Indicacao_final</w:t>
+      </w:r>
+      <w:r>
+        <w:t xml:space="preserve"> </w:t>
+      </w:r>
+      <w:r>
+        <w:t xml:space="preserve">(banco</w:t>
+      </w:r>
+      <w:r>
+        <w:t xml:space="preserve"> </w:t>
+      </w:r>
+      <w:r>
+        <w:rPr>
+          <w:rStyle w:val="VerbatimChar"/>
+        </w:rPr>
+        <w:t xml:space="preserve">BD_completo_corrigido_13-05-2026.xls</w:t>
+      </w:r>
+      <w:r>
+        <w:t xml:space="preserve">,</w:t>
+      </w:r>
+      <w:r>
+        <w:t xml:space="preserve"> </w:t>
+      </w:r>
+      <w:r>
+        <w:t xml:space="preserve">aba</w:t>
+      </w:r>
+      <w:r>
+        <w:t xml:space="preserve"> </w:t>
+      </w:r>
+      <w:r>
+        <w:rPr>
+          <w:rStyle w:val="VerbatimChar"/>
+        </w:rPr>
+        <w:t xml:space="preserve">BD_leticia_08-05</w:t>
+      </w:r>
+      <w:r>
+        <w:t xml:space="preserve">), que organiza em categorias clínicas os motivos antes dispersos</w:t>
+      </w:r>
+      <w:r>
+        <w:t xml:space="preserve"> </w:t>
+      </w:r>
+      <w:r>
+        <w:t xml:space="preserve">ou ausentes em</w:t>
+      </w:r>
+      <w:r>
+        <w:t xml:space="preserve"> </w:t>
+      </w:r>
+      <w:r>
+        <w:rPr>
+          <w:rStyle w:val="VerbatimChar"/>
+        </w:rPr>
+        <w:t xml:space="preserve">indicacao_cat</w:t>
+      </w:r>
+      <w:r>
+        <w:t xml:space="preserve">. O ganho é grande: na versão anterior,</w:t>
+      </w:r>
+      <w:r>
+        <w:t xml:space="preserve"> </w:t>
+      </w:r>
+      <w:r>
+        <w:rPr>
+          <w:b/>
+        </w:rPr>
+        <w:t xml:space="preserve">68,4% das</w:t>
+      </w:r>
+      <w:r>
+        <w:rPr>
+          <w:b/>
+        </w:rPr>
+        <w:t xml:space="preserve"> </w:t>
+      </w:r>
+      <w:r>
+        <w:rPr>
+          <w:b/>
+        </w:rPr>
+        <w:t xml:space="preserve">cesáreas de adolescentes</w:t>
+      </w:r>
+      <w:r>
+        <w:t xml:space="preserve"> </w:t>
+      </w:r>
+      <w:r>
+        <w:t xml:space="preserve">apareciam como</w:t>
+      </w:r>
+      <w:r>
+        <w:t xml:space="preserve"> </w:t>
+      </w:r>
+      <w:r>
+        <w:rPr>
+          <w:i/>
+        </w:rPr>
+        <w:t xml:space="preserve">“</w:t>
+      </w:r>
+      <w:r>
+        <w:rPr>
+          <w:i/>
+        </w:rPr>
+        <w:t xml:space="preserve">Não informada</w:t>
+      </w:r>
+      <w:r>
+        <w:rPr>
+          <w:i/>
+        </w:rPr>
+        <w:t xml:space="preserve">”</w:t>
+      </w:r>
+      <w:r>
+        <w:t xml:space="preserve">; com</w:t>
+      </w:r>
+      <w:r>
+        <w:t xml:space="preserve"> </w:t>
+      </w:r>
+      <w:r>
+        <w:rPr>
+          <w:rStyle w:val="VerbatimChar"/>
+        </w:rPr>
+        <w:t xml:space="preserve">Indicacao_final</w:t>
+      </w:r>
+      <w:r>
+        <w:t xml:space="preserve">, essa</w:t>
+      </w:r>
+      <w:r>
+        <w:t xml:space="preserve"> </w:t>
+      </w:r>
+      <w:r>
+        <w:t xml:space="preserve">lacuna</w:t>
+      </w:r>
+      <w:r>
+        <w:t xml:space="preserve"> </w:t>
+      </w:r>
+      <w:r>
+        <w:rPr>
+          <w:b/>
+        </w:rPr>
+        <w:t xml:space="preserve">praticamente desaparece</w:t>
+      </w:r>
+      <w:r>
+        <w:t xml:space="preserve"> </w:t>
+      </w:r>
+      <w:r>
+        <w:t xml:space="preserve">e as indicações ficam classificadas.</w:t>
+      </w:r>
+    </w:p>
+    <w:p>
+      <w:pPr>
+        <w:pStyle w:val="BlockText"/>
+      </w:pPr>
+      <w:r>
+        <w:rPr>
+          <w:b/>
+        </w:rPr>
+        <w:t xml:space="preserve">Fórcipe:</w:t>
+      </w:r>
+      <w:r>
+        <w:t xml:space="preserve"> </w:t>
+      </w:r>
+      <w:r>
+        <w:rPr>
+          <w:b/>
+        </w:rPr>
+        <w:t xml:space="preserve">todos</w:t>
+      </w:r>
+      <w:r>
+        <w:t xml:space="preserve"> </w:t>
+      </w:r>
+      <w:r>
+        <w:t xml:space="preserve">os partos a fórcipe têm</w:t>
+      </w:r>
+      <w:r>
+        <w:t xml:space="preserve"> </w:t>
+      </w:r>
+      <w:r>
+        <w:rPr>
+          <w:rStyle w:val="VerbatimChar"/>
+        </w:rPr>
+        <w:t xml:space="preserve">Indicacao_final = 888</w:t>
+      </w:r>
+      <w:r>
+        <w:t xml:space="preserve"> </w:t>
+      </w:r>
+      <w:r>
+        <w:t xml:space="preserve">(a variável não</w:t>
+      </w:r>
+      <w:r>
+        <w:t xml:space="preserve"> </w:t>
+      </w:r>
+      <w:r>
+        <w:t xml:space="preserve">subdivide o fórcipe). Por isso as indicações de fórcipe</w:t>
+      </w:r>
+      <w:r>
+        <w:t xml:space="preserve"> </w:t>
+      </w:r>
+      <w:r>
+        <w:rPr>
+          <w:b/>
+        </w:rPr>
+        <w:t xml:space="preserve">continuam vindo de</w:t>
+      </w:r>
+      <w:r>
+        <w:rPr>
+          <w:b/>
+        </w:rPr>
+        <w:t xml:space="preserve"> </w:t>
+      </w:r>
+      <w:r>
+        <w:rPr>
+          <w:rStyle w:val="VerbatimChar"/>
+          <w:b/>
+        </w:rPr>
+        <w:t xml:space="preserve">indicacao_cat</w:t>
+      </w:r>
+      <w:r>
+        <w:t xml:space="preserve"> </w:t>
+      </w:r>
+      <w:r>
+        <w:t xml:space="preserve">— a Tabela 9 mantém a mesma lógica de antes (apenas recalculada na</w:t>
+      </w:r>
+      <w:r>
+        <w:t xml:space="preserve"> </w:t>
+      </w:r>
+      <w:r>
+        <w:t xml:space="preserve">coorte unificada).</w:t>
+      </w:r>
+    </w:p>
+    <w:p>
+      <w:pPr>
+        <w:pStyle w:val="FirstParagraph"/>
+      </w:pPr>
+      <w:r>
+        <w:rPr>
+          <w:b/>
+        </w:rPr>
+        <w:t xml:space="preserve">Coorte e procedimento (para os Métodos).</w:t>
+      </w:r>
+      <w:r>
+        <w:t xml:space="preserve"> </w:t>
+      </w:r>
+      <w:r>
+        <w:t xml:space="preserve">Para manter a consistência com o resto da</w:t>
+      </w:r>
+      <w:r>
+        <w:t xml:space="preserve"> </w:t>
+      </w:r>
+      <w:r>
+        <w:t xml:space="preserve">dissertação (coorte §3.3,</w:t>
+      </w:r>
+      <w:r>
+        <w:t xml:space="preserve"> </w:t>
+      </w:r>
+      <w:r>
+        <w:rPr>
+          <w:b/>
+        </w:rPr>
+        <w:t xml:space="preserve">N = 6.650</w:t>
+      </w:r>
+      <w:r>
+        <w:t xml:space="preserve">), os campos</w:t>
+      </w:r>
+      <w:r>
+        <w:t xml:space="preserve"> </w:t>
+      </w:r>
+      <w:r>
+        <w:rPr>
+          <w:rStyle w:val="VerbatimChar"/>
+        </w:rPr>
+        <w:t xml:space="preserve">Indicacao_final</w:t>
+      </w:r>
+      <w:r>
+        <w:t xml:space="preserve"> </w:t>
+      </w:r>
+      <w:r>
+        <w:t xml:space="preserve">e</w:t>
+      </w:r>
+      <w:r>
+        <w:t xml:space="preserve"> </w:t>
+      </w:r>
+      <w:r>
+        <w:rPr>
+          <w:rStyle w:val="VerbatimChar"/>
+        </w:rPr>
+        <w:t xml:space="preserve">indicacao_cat</w:t>
+      </w:r>
+      <w:r>
+        <w:t xml:space="preserve"> </w:t>
+      </w:r>
+      <w:r>
+        <w:t xml:space="preserve">do banco 13-05 foram</w:t>
+      </w:r>
+      <w:r>
+        <w:t xml:space="preserve"> </w:t>
+      </w:r>
+      <w:r>
+        <w:rPr>
+          <w:b/>
+        </w:rPr>
+        <w:t xml:space="preserve">unidos por chave (RGHC + idade + tipo de parto)</w:t>
+      </w:r>
+      <w:r>
+        <w:t xml:space="preserve"> </w:t>
+      </w:r>
+      <w:r>
+        <w:t xml:space="preserve">à coorte já</w:t>
+      </w:r>
+      <w:r>
+        <w:t xml:space="preserve"> </w:t>
+      </w:r>
+      <w:r>
+        <w:t xml:space="preserve">elegível. O pareamento cobriu</w:t>
+      </w:r>
+      <w:r>
+        <w:t xml:space="preserve"> </w:t>
+      </w:r>
+      <w:r>
+        <w:rPr>
+          <w:b/>
+        </w:rPr>
+        <w:t xml:space="preserve">4.651 dos 4.653 partos operatórios</w:t>
+      </w:r>
+      <w:r>
+        <w:t xml:space="preserve"> </w:t>
+      </w:r>
+      <w:r>
+        <w:t xml:space="preserve">(2 casos sem</w:t>
+      </w:r>
+      <w:r>
+        <w:t xml:space="preserve"> </w:t>
+      </w:r>
+      <w:r>
+        <w:t xml:space="preserve">correspondência no banco novo →</w:t>
+      </w:r>
+      <w:r>
+        <w:t xml:space="preserve"> </w:t>
+      </w:r>
+      <w:r>
+        <w:t xml:space="preserve">“</w:t>
+      </w:r>
+      <w:r>
+        <w:t xml:space="preserve">Não informada</w:t>
+      </w:r>
+      <w:r>
+        <w:t xml:space="preserve">”</w:t>
+      </w:r>
+      <w:r>
+        <w:t xml:space="preserve">). Cada código de</w:t>
+      </w:r>
+      <w:r>
+        <w:t xml:space="preserve"> </w:t>
+      </w:r>
+      <w:r>
+        <w:rPr>
+          <w:rStyle w:val="VerbatimChar"/>
+        </w:rPr>
+        <w:t xml:space="preserve">Indicacao_final</w:t>
+      </w:r>
+      <w:r>
+        <w:t xml:space="preserve"> </w:t>
+      </w:r>
+      <w:r>
+        <w:t xml:space="preserve">foi</w:t>
+      </w:r>
+      <w:r>
+        <w:t xml:space="preserve"> </w:t>
+      </w:r>
+      <w:r>
+        <w:t xml:space="preserve">rotulado pelo seu</w:t>
+      </w:r>
+      <w:r>
+        <w:t xml:space="preserve"> </w:t>
+      </w:r>
+      <w:r>
+        <w:rPr>
+          <w:rStyle w:val="VerbatimChar"/>
+        </w:rPr>
+        <w:t xml:space="preserve">indicacao_cat</w:t>
+      </w:r>
+      <w:r>
+        <w:t xml:space="preserve"> </w:t>
+      </w:r>
+      <w:r>
+        <w:t xml:space="preserve">predominante. Reprodução:</w:t>
+      </w:r>
+      <w:r>
+        <w:t xml:space="preserve"> </w:t>
+      </w:r>
+      <w:r>
+        <w:rPr>
+          <w:rStyle w:val="VerbatimChar"/>
+        </w:rPr>
+        <w:t xml:space="preserve">analysis/03_indicacoes_parto.R</w:t>
+      </w:r>
+      <w:r>
+        <w:t xml:space="preserve">.</w:t>
+      </w:r>
+    </w:p>
+    <w:p>
+      <w:pPr>
+        <w:pStyle w:val="BlockText"/>
+      </w:pPr>
+      <w:r>
+        <w:rPr>
+          <w:b/>
+        </w:rPr>
+        <w:t xml:space="preserve">Frase sugerida para os Métodos:</w:t>
+      </w:r>
+      <w:r>
+        <w:t xml:space="preserve"> </w:t>
+      </w:r>
+      <w:r>
+        <w:t xml:space="preserve">“</w:t>
+      </w:r>
+      <w:r>
+        <w:t xml:space="preserve">As indicações de cesárea foram agrupadas segundo</w:t>
+      </w:r>
+      <w:r>
+        <w:t xml:space="preserve"> </w:t>
+      </w:r>
+      <w:r>
+        <w:t xml:space="preserve">a variável</w:t>
+      </w:r>
+      <w:r>
+        <w:t xml:space="preserve"> </w:t>
+      </w:r>
+      <w:r>
+        <w:rPr>
+          <w:rStyle w:val="VerbatimChar"/>
+        </w:rPr>
+        <w:t xml:space="preserve">Indicacao_final</w:t>
+      </w:r>
+      <w:r>
+        <w:t xml:space="preserve">, que classifica hierarquicamente os motivos registrados</w:t>
+      </w:r>
+      <w:r>
+        <w:t xml:space="preserve"> </w:t>
+      </w:r>
+      <w:r>
+        <w:t xml:space="preserve">em</w:t>
+      </w:r>
+      <w:r>
+        <w:t xml:space="preserve"> </w:t>
+      </w:r>
+      <w:r>
+        <w:rPr>
+          <w:rStyle w:val="VerbatimChar"/>
+        </w:rPr>
+        <w:t xml:space="preserve">indicacao_cat</w:t>
+      </w:r>
+      <w:r>
+        <w:t xml:space="preserve">. As indicações de parto a fórcipe foram descritas a partir de</w:t>
+      </w:r>
+      <w:r>
+        <w:t xml:space="preserve"> </w:t>
+      </w:r>
+      <w:r>
+        <w:rPr>
+          <w:rStyle w:val="VerbatimChar"/>
+        </w:rPr>
+        <w:t xml:space="preserve">indicacao_cat</w:t>
+      </w:r>
+      <w:r>
+        <w:t xml:space="preserve">. Os percentuais foram calculados sobre o total de cada via em cada</w:t>
+      </w:r>
+      <w:r>
+        <w:t xml:space="preserve"> </w:t>
+      </w:r>
+      <w:r>
+        <w:t xml:space="preserve">grupo etário.</w:t>
+      </w:r>
+      <w:r>
+        <w:t xml:space="preserve">”</w:t>
+      </w:r>
+    </w:p>
+    <w:p>
+      <w:pPr>
+        <w:pStyle w:val="Heading3"/>
+      </w:pPr>
+      <w:bookmarkStart w:id="45" w:name="X9e9f2093f3296f3c96c4983d3b7a875b7bd5e9c"/>
+      <w:r>
+        <w:t xml:space="preserve">8.1 Tabela 8 (NOVA) — Indicações de cesárea, top 5 por grupo</w:t>
+      </w:r>
+      <w:bookmarkEnd w:id="45"/>
+    </w:p>
+    <w:p>
+      <w:pPr>
+        <w:pStyle w:val="FirstParagraph"/>
+      </w:pPr>
+      <w:r>
+        <w:t xml:space="preserve">Percentuais sobre o total de cesáreas do grupo (Adolescentes = 433; Adultas = 3.313).</w:t>
+      </w:r>
+    </w:p>
+    <w:tbl>
+      <w:tblPr>
+        <w:tblStyle w:val="Table"/>
+        <w:tblW w:type="pct" w:w="0.0"/>
+        <w:tblLook w:firstRow="1"/>
+      </w:tblPr>
+      <w:tblGrid/>
+      <w:tr>
+        <w:trPr>
+          <w:cnfStyle w:firstRow="1"/>
+        </w:trPr>
+        <w:tc>
+          <w:tcPr>
+            <w:tcBorders>
+              <w:bottom w:val="single"/>
+            </w:tcBorders>
+            <w:vAlign w:val="bottom"/>
+          </w:tcPr>
+          <w:p>
+            <w:pPr>
+              <w:pStyle w:val="Compact"/>
+              <w:jc w:val="left"/>
+            </w:pPr>
+            <w:r>
+              <w:t xml:space="preserve">Grupo</w:t>
+            </w:r>
+          </w:p>
+        </w:tc>
+        <w:tc>
+          <w:tcPr>
+            <w:tcBorders>
+              <w:bottom w:val="single"/>
+            </w:tcBorders>
+            <w:vAlign w:val="bottom"/>
+          </w:tcPr>
+          <w:p>
+            <w:pPr>
+              <w:pStyle w:val="Compact"/>
+              <w:jc w:val="left"/>
+            </w:pPr>
+            <w:r>
+              <w:t xml:space="preserve">Indicação</w:t>
+            </w:r>
+          </w:p>
+        </w:tc>
+        <w:tc>
+          <w:tcPr>
+            <w:tcBorders>
+              <w:bottom w:val="single"/>
+            </w:tcBorders>
+            <w:vAlign w:val="bottom"/>
+          </w:tcPr>
+          <w:p>
+            <w:pPr>
+              <w:pStyle w:val="Compact"/>
+              <w:jc w:val="left"/>
+            </w:pPr>
+            <w:r>
+              <w:t xml:space="preserve">n</w:t>
+            </w:r>
+          </w:p>
+        </w:tc>
+        <w:tc>
+          <w:tcPr>
+            <w:tcBorders>
+              <w:bottom w:val="single"/>
+            </w:tcBorders>
+            <w:vAlign w:val="bottom"/>
+          </w:tcPr>
+          <w:p>
+            <w:pPr>
+              <w:pStyle w:val="Compact"/>
+              <w:jc w:val="left"/>
+            </w:pPr>
+            <w:r>
+              <w:t xml:space="preserve">%</w:t>
+            </w:r>
+          </w:p>
+        </w:tc>
+      </w:tr>
+      <w:tr>
+        <w:tc>
+          <w:p>
+            <w:pPr>
+              <w:pStyle w:val="Compact"/>
+              <w:jc w:val="left"/>
+            </w:pPr>
+            <w:r>
+              <w:t xml:space="preserve">Adolescentes</w:t>
+            </w:r>
+          </w:p>
+        </w:tc>
+        <w:tc>
+          <w:p>
+            <w:pPr>
+              <w:pStyle w:val="Compact"/>
+              <w:jc w:val="left"/>
+            </w:pPr>
+            <w:r>
+              <w:t xml:space="preserve">Sofrimento fetal</w:t>
+            </w:r>
+          </w:p>
+        </w:tc>
+        <w:tc>
+          <w:p>
+            <w:pPr>
+              <w:pStyle w:val="Compact"/>
+              <w:jc w:val="left"/>
+            </w:pPr>
+            <w:r>
+              <w:t xml:space="preserve">122</w:t>
+            </w:r>
+          </w:p>
+        </w:tc>
+        <w:tc>
+          <w:p>
+            <w:pPr>
+              <w:pStyle w:val="Compact"/>
+              <w:jc w:val="left"/>
+            </w:pPr>
+            <w:r>
+              <w:t xml:space="preserve">28,2</w:t>
+            </w:r>
+          </w:p>
+        </w:tc>
+      </w:tr>
+      <w:tr>
+        <w:tc>
+          <w:p>
+            <w:pPr>
+              <w:pStyle w:val="Compact"/>
+              <w:jc w:val="left"/>
+            </w:pPr>
+            <w:r>
+              <w:t xml:space="preserve">Adolescentes</w:t>
+            </w:r>
+          </w:p>
+        </w:tc>
+        <w:tc>
+          <w:p>
+            <w:pPr>
+              <w:pStyle w:val="Compact"/>
+              <w:jc w:val="left"/>
+            </w:pPr>
+            <w:r>
+              <w:t xml:space="preserve">Distocia funcional</w:t>
+            </w:r>
+          </w:p>
+        </w:tc>
+        <w:tc>
+          <w:p>
+            <w:pPr>
+              <w:pStyle w:val="Compact"/>
+              <w:jc w:val="left"/>
+            </w:pPr>
+            <w:r>
+              <w:t xml:space="preserve">78</w:t>
+            </w:r>
+          </w:p>
+        </w:tc>
+        <w:tc>
+          <w:p>
+            <w:pPr>
+              <w:pStyle w:val="Compact"/>
+              <w:jc w:val="left"/>
+            </w:pPr>
+            <w:r>
+              <w:t xml:space="preserve">18,0</w:t>
+            </w:r>
+          </w:p>
+        </w:tc>
+      </w:tr>
+      <w:tr>
+        <w:tc>
+          <w:p>
+            <w:pPr>
+              <w:pStyle w:val="Compact"/>
+              <w:jc w:val="left"/>
+            </w:pPr>
+            <w:r>
+              <w:t xml:space="preserve">Adolescentes</w:t>
+            </w:r>
+          </w:p>
+        </w:tc>
+        <w:tc>
+          <w:p>
+            <w:pPr>
+              <w:pStyle w:val="Compact"/>
+              <w:jc w:val="left"/>
+            </w:pPr>
+            <w:r>
+              <w:t xml:space="preserve">Outras</w:t>
+            </w:r>
+          </w:p>
+        </w:tc>
+        <w:tc>
+          <w:p>
+            <w:pPr>
+              <w:pStyle w:val="Compact"/>
+              <w:jc w:val="left"/>
+            </w:pPr>
+            <w:r>
+              <w:t xml:space="preserve">74</w:t>
+            </w:r>
+          </w:p>
+        </w:tc>
+        <w:tc>
+          <w:p>
+            <w:pPr>
+              <w:pStyle w:val="Compact"/>
+              <w:jc w:val="left"/>
+            </w:pPr>
+            <w:r>
+              <w:t xml:space="preserve">17,1</w:t>
+            </w:r>
+          </w:p>
+        </w:tc>
+      </w:tr>
+      <w:tr>
+        <w:tc>
+          <w:p>
+            <w:pPr>
+              <w:pStyle w:val="Compact"/>
+              <w:jc w:val="left"/>
+            </w:pPr>
+            <w:r>
+              <w:t xml:space="preserve">Adolescentes</w:t>
+            </w:r>
+          </w:p>
+        </w:tc>
+        <w:tc>
+          <w:p>
+            <w:pPr>
+              <w:pStyle w:val="Compact"/>
+              <w:jc w:val="left"/>
+            </w:pPr>
+            <w:r>
+              <w:t xml:space="preserve">Desproporção céfalo-pélvica</w:t>
+            </w:r>
+          </w:p>
+        </w:tc>
+        <w:tc>
+          <w:p>
+            <w:pPr>
+              <w:pStyle w:val="Compact"/>
+              <w:jc w:val="left"/>
+            </w:pPr>
+            <w:r>
+              <w:t xml:space="preserve">73</w:t>
+            </w:r>
+          </w:p>
+        </w:tc>
+        <w:tc>
+          <w:p>
+            <w:pPr>
+              <w:pStyle w:val="Compact"/>
+              <w:jc w:val="left"/>
+            </w:pPr>
+            <w:r>
+              <w:t xml:space="preserve">16,9</w:t>
+            </w:r>
+          </w:p>
+        </w:tc>
+      </w:tr>
+      <w:tr>
+        <w:tc>
+          <w:p>
+            <w:pPr>
+              <w:pStyle w:val="Compact"/>
+              <w:jc w:val="left"/>
+            </w:pPr>
+            <w:r>
+              <w:t xml:space="preserve">Adolescentes</w:t>
+            </w:r>
+          </w:p>
+        </w:tc>
+        <w:tc>
+          <w:p>
+            <w:pPr>
+              <w:pStyle w:val="Compact"/>
+              <w:jc w:val="left"/>
+            </w:pPr>
+            <w:r>
+              <w:t xml:space="preserve">Apresentação pélvica</w:t>
+            </w:r>
+          </w:p>
+        </w:tc>
+        <w:tc>
+          <w:p>
+            <w:pPr>
+              <w:pStyle w:val="Compact"/>
+              <w:jc w:val="left"/>
+            </w:pPr>
+            <w:r>
+              <w:t xml:space="preserve">33</w:t>
+            </w:r>
+          </w:p>
+        </w:tc>
+        <w:tc>
+          <w:p>
+            <w:pPr>
+              <w:pStyle w:val="Compact"/>
+              <w:jc w:val="left"/>
+            </w:pPr>
+            <w:r>
+              <w:t xml:space="preserve">7,6</w:t>
+            </w:r>
+          </w:p>
+        </w:tc>
+      </w:tr>
+      <w:tr>
+        <w:tc>
+          <w:p>
+            <w:pPr>
+              <w:pStyle w:val="Compact"/>
+              <w:jc w:val="left"/>
+            </w:pPr>
+            <w:r>
+              <w:t xml:space="preserve">Adultas</w:t>
+            </w:r>
+          </w:p>
+        </w:tc>
+        <w:tc>
+          <w:p>
+            <w:pPr>
+              <w:pStyle w:val="Compact"/>
+              <w:jc w:val="left"/>
+            </w:pPr>
+            <w:r>
+              <w:t xml:space="preserve">Sofrimento fetal</w:t>
+            </w:r>
+          </w:p>
+        </w:tc>
+        <w:tc>
+          <w:p>
+            <w:pPr>
+              <w:pStyle w:val="Compact"/>
+              <w:jc w:val="left"/>
+            </w:pPr>
+            <w:r>
+              <w:t xml:space="preserve">728</w:t>
+            </w:r>
+          </w:p>
+        </w:tc>
+        <w:tc>
+          <w:p>
+            <w:pPr>
+              <w:pStyle w:val="Compact"/>
+              <w:jc w:val="left"/>
+            </w:pPr>
+            <w:r>
+              <w:t xml:space="preserve">22,0</w:t>
+            </w:r>
+          </w:p>
+        </w:tc>
+      </w:tr>
+      <w:tr>
+        <w:tc>
+          <w:p>
+            <w:pPr>
+              <w:pStyle w:val="Compact"/>
+              <w:jc w:val="left"/>
+            </w:pPr>
+            <w:r>
+              <w:t xml:space="preserve">Adultas</w:t>
+            </w:r>
+          </w:p>
+        </w:tc>
+        <w:tc>
+          <w:p>
+            <w:pPr>
+              <w:pStyle w:val="Compact"/>
+              <w:jc w:val="left"/>
+            </w:pPr>
+            <w:r>
+              <w:t xml:space="preserve">Patologia materna</w:t>
+            </w:r>
+          </w:p>
+        </w:tc>
+        <w:tc>
+          <w:p>
+            <w:pPr>
+              <w:pStyle w:val="Compact"/>
+              <w:jc w:val="left"/>
+            </w:pPr>
+            <w:r>
+              <w:t xml:space="preserve">486</w:t>
+            </w:r>
+          </w:p>
+        </w:tc>
+        <w:tc>
+          <w:p>
+            <w:pPr>
+              <w:pStyle w:val="Compact"/>
+              <w:jc w:val="left"/>
+            </w:pPr>
+            <w:r>
+              <w:t xml:space="preserve">14,7</w:t>
+            </w:r>
+          </w:p>
+        </w:tc>
+      </w:tr>
+      <w:tr>
+        <w:tc>
+          <w:p>
+            <w:pPr>
+              <w:pStyle w:val="Compact"/>
+              <w:jc w:val="left"/>
+            </w:pPr>
+            <w:r>
+              <w:t xml:space="preserve">Adultas</w:t>
+            </w:r>
+          </w:p>
+        </w:tc>
+        <w:tc>
+          <w:p>
+            <w:pPr>
+              <w:pStyle w:val="Compact"/>
+              <w:jc w:val="left"/>
+            </w:pPr>
+            <w:r>
+              <w:t xml:space="preserve">Distocia funcional</w:t>
+            </w:r>
+          </w:p>
+        </w:tc>
+        <w:tc>
+          <w:p>
+            <w:pPr>
+              <w:pStyle w:val="Compact"/>
+              <w:jc w:val="left"/>
+            </w:pPr>
+            <w:r>
+              <w:t xml:space="preserve">401</w:t>
+            </w:r>
+          </w:p>
+        </w:tc>
+        <w:tc>
+          <w:p>
+            <w:pPr>
+              <w:pStyle w:val="Compact"/>
+              <w:jc w:val="left"/>
+            </w:pPr>
+            <w:r>
+              <w:t xml:space="preserve">12,1</w:t>
+            </w:r>
+          </w:p>
+        </w:tc>
+      </w:tr>
+      <w:tr>
+        <w:tc>
+          <w:p>
+            <w:pPr>
+              <w:pStyle w:val="Compact"/>
+              <w:jc w:val="left"/>
+            </w:pPr>
+            <w:r>
+              <w:t xml:space="preserve">Adultas</w:t>
+            </w:r>
+          </w:p>
+        </w:tc>
+        <w:tc>
+          <w:p>
+            <w:pPr>
+              <w:pStyle w:val="Compact"/>
+              <w:jc w:val="left"/>
+            </w:pPr>
+            <w:r>
+              <w:t xml:space="preserve">Iteratividade</w:t>
+            </w:r>
+          </w:p>
+        </w:tc>
+        <w:tc>
+          <w:p>
+            <w:pPr>
+              <w:pStyle w:val="Compact"/>
+              <w:jc w:val="left"/>
+            </w:pPr>
+            <w:r>
+              <w:t xml:space="preserve">371</w:t>
+            </w:r>
+          </w:p>
+        </w:tc>
+        <w:tc>
+          <w:p>
+            <w:pPr>
+              <w:pStyle w:val="Compact"/>
+              <w:jc w:val="left"/>
+            </w:pPr>
+            <w:r>
+              <w:t xml:space="preserve">11,2</w:t>
+            </w:r>
+          </w:p>
+        </w:tc>
+      </w:tr>
+      <w:tr>
+        <w:tc>
+          <w:p>
+            <w:pPr>
+              <w:pStyle w:val="Compact"/>
+              <w:jc w:val="left"/>
+            </w:pPr>
+            <w:r>
+              <w:t xml:space="preserve">Adultas</w:t>
+            </w:r>
+          </w:p>
+        </w:tc>
+        <w:tc>
+          <w:p>
+            <w:pPr>
+              <w:pStyle w:val="Compact"/>
+              <w:jc w:val="left"/>
+            </w:pPr>
+            <w:r>
+              <w:t xml:space="preserve">Contraindicação de indução</w:t>
+            </w:r>
+          </w:p>
+        </w:tc>
+        <w:tc>
+          <w:p>
+            <w:pPr>
+              <w:pStyle w:val="Compact"/>
+              <w:jc w:val="left"/>
+            </w:pPr>
+            <w:r>
+              <w:t xml:space="preserve">340</w:t>
+            </w:r>
+          </w:p>
+        </w:tc>
+        <w:tc>
+          <w:p>
+            <w:pPr>
+              <w:pStyle w:val="Compact"/>
+              <w:jc w:val="left"/>
+            </w:pPr>
+            <w:r>
+              <w:t xml:space="preserve">10,3</w:t>
+            </w:r>
+          </w:p>
+        </w:tc>
+      </w:tr>
+    </w:tbl>
+    <w:p>
+      <w:pPr>
+        <w:pStyle w:val="BodyText"/>
+      </w:pPr>
+      <w:r>
+        <w:t xml:space="preserve">Rodapé sugerido:</w:t>
+      </w:r>
+      <w:r>
+        <w:t xml:space="preserve"> </w:t>
+      </w:r>
+      <w:r>
+        <w:rPr>
+          <w:i/>
+        </w:rPr>
+        <w:t xml:space="preserve">“</w:t>
+      </w:r>
+      <w:r>
+        <w:rPr>
+          <w:i/>
+        </w:rPr>
+        <w:t xml:space="preserve">‘</w:t>
+      </w:r>
+      <w:r>
+        <w:rPr>
+          <w:i/>
+        </w:rPr>
+        <w:t xml:space="preserve">Outras</w:t>
+      </w:r>
+      <w:r>
+        <w:rPr>
+          <w:i/>
+        </w:rPr>
+        <w:t xml:space="preserve">’</w:t>
+      </w:r>
+      <w:r>
+        <w:rPr>
+          <w:i/>
+        </w:rPr>
+        <w:t xml:space="preserve"> </w:t>
+      </w:r>
+      <w:r>
+        <w:rPr>
+          <w:i/>
+        </w:rPr>
+        <w:t xml:space="preserve">reúne o código</w:t>
+      </w:r>
+      <w:r>
+        <w:rPr>
+          <w:i/>
+        </w:rPr>
+        <w:t xml:space="preserve"> </w:t>
+      </w:r>
+      <w:r>
+        <w:rPr>
+          <w:rStyle w:val="VerbatimChar"/>
+          <w:i/>
+        </w:rPr>
+        <w:t xml:space="preserve">Indicacao_final</w:t>
+      </w:r>
+      <w:r>
+        <w:rPr>
+          <w:i/>
+        </w:rPr>
+        <w:t xml:space="preserve"> </w:t>
+      </w:r>
+      <w:r>
+        <w:rPr>
+          <w:i/>
+        </w:rPr>
+        <w:t xml:space="preserve">999 (motivo não</w:t>
+      </w:r>
+      <w:r>
+        <w:rPr>
+          <w:i/>
+        </w:rPr>
+        <w:t xml:space="preserve"> </w:t>
+      </w:r>
+      <w:r>
+        <w:rPr>
+          <w:i/>
+        </w:rPr>
+        <w:t xml:space="preserve">especificado) e casos residuais. Percentuais sobre o total de cesáreas de cada grupo.</w:t>
+      </w:r>
+      <w:r>
+        <w:rPr>
+          <w:i/>
+        </w:rPr>
+        <w:t xml:space="preserve">”</w:t>
+      </w:r>
+    </w:p>
+    <w:p>
+      <w:pPr>
+        <w:pStyle w:val="Heading3"/>
+      </w:pPr>
+      <w:bookmarkStart w:id="46" w:name="X1f48280d982d0d0f2745ef1ea8dddcb741fa022"/>
+      <w:r>
+        <w:t xml:space="preserve">8.2 Tabela 9 (atualizada) — Indicações de fórcipe, top 5 por grupo</w:t>
+      </w:r>
+      <w:bookmarkEnd w:id="46"/>
+    </w:p>
+    <w:p>
+      <w:pPr>
+        <w:pStyle w:val="FirstParagraph"/>
+      </w:pPr>
+      <w:r>
+        <w:t xml:space="preserve">Percentuais sobre o total de fórcipes do grupo (Adolescentes = 363; Adultas = 544).</w:t>
+      </w:r>
+    </w:p>
+    <w:tbl>
+      <w:tblPr>
+        <w:tblStyle w:val="Table"/>
+        <w:tblW w:type="pct" w:w="0.0"/>
+        <w:tblLook w:firstRow="1"/>
+      </w:tblPr>
+      <w:tblGrid/>
+      <w:tr>
+        <w:trPr>
+          <w:cnfStyle w:firstRow="1"/>
+        </w:trPr>
+        <w:tc>
+          <w:tcPr>
+            <w:tcBorders>
+              <w:bottom w:val="single"/>
+            </w:tcBorders>
+            <w:vAlign w:val="bottom"/>
+          </w:tcPr>
+          <w:p>
+            <w:pPr>
+              <w:pStyle w:val="Compact"/>
+              <w:jc w:val="left"/>
+            </w:pPr>
+            <w:r>
+              <w:t xml:space="preserve">Grupo</w:t>
+            </w:r>
+          </w:p>
+        </w:tc>
+        <w:tc>
+          <w:tcPr>
+            <w:tcBorders>
+              <w:bottom w:val="single"/>
+            </w:tcBorders>
+            <w:vAlign w:val="bottom"/>
+          </w:tcPr>
+          <w:p>
+            <w:pPr>
+              <w:pStyle w:val="Compact"/>
+              <w:jc w:val="left"/>
+            </w:pPr>
+            <w:r>
+              <w:t xml:space="preserve">Indicação</w:t>
+            </w:r>
+          </w:p>
+        </w:tc>
+        <w:tc>
+          <w:tcPr>
+            <w:tcBorders>
+              <w:bottom w:val="single"/>
+            </w:tcBorders>
+            <w:vAlign w:val="bottom"/>
+          </w:tcPr>
+          <w:p>
+            <w:pPr>
+              <w:pStyle w:val="Compact"/>
+              <w:jc w:val="left"/>
+            </w:pPr>
+            <w:r>
+              <w:t xml:space="preserve">n</w:t>
+            </w:r>
+          </w:p>
+        </w:tc>
+        <w:tc>
+          <w:tcPr>
+            <w:tcBorders>
+              <w:bottom w:val="single"/>
+            </w:tcBorders>
+            <w:vAlign w:val="bottom"/>
+          </w:tcPr>
+          <w:p>
+            <w:pPr>
+              <w:pStyle w:val="Compact"/>
+              <w:jc w:val="left"/>
+            </w:pPr>
+            <w:r>
+              <w:t xml:space="preserve">%</w:t>
+            </w:r>
+          </w:p>
+        </w:tc>
+      </w:tr>
+      <w:tr>
+        <w:tc>
+          <w:p>
+            <w:pPr>
+              <w:pStyle w:val="Compact"/>
+              <w:jc w:val="left"/>
+            </w:pPr>
+            <w:r>
+              <w:t xml:space="preserve">Adolescentes</w:t>
+            </w:r>
+          </w:p>
+        </w:tc>
+        <w:tc>
+          <w:p>
+            <w:pPr>
+              <w:pStyle w:val="Compact"/>
+              <w:jc w:val="left"/>
+            </w:pPr>
+            <w:r>
+              <w:t xml:space="preserve">Não informada</w:t>
+            </w:r>
+          </w:p>
+        </w:tc>
+        <w:tc>
+          <w:p>
+            <w:pPr>
+              <w:pStyle w:val="Compact"/>
+              <w:jc w:val="left"/>
+            </w:pPr>
+            <w:r>
+              <w:t xml:space="preserve">216</w:t>
+            </w:r>
+          </w:p>
+        </w:tc>
+        <w:tc>
+          <w:p>
+            <w:pPr>
+              <w:pStyle w:val="Compact"/>
+              <w:jc w:val="left"/>
+            </w:pPr>
+            <w:r>
+              <w:t xml:space="preserve">59,5</w:t>
+            </w:r>
+          </w:p>
+        </w:tc>
+      </w:tr>
+      <w:tr>
+        <w:tc>
+          <w:p>
+            <w:pPr>
+              <w:pStyle w:val="Compact"/>
+              <w:jc w:val="left"/>
+            </w:pPr>
+            <w:r>
+              <w:t xml:space="preserve">Adolescentes</w:t>
+            </w:r>
+          </w:p>
+        </w:tc>
+        <w:tc>
+          <w:p>
+            <w:pPr>
+              <w:pStyle w:val="Compact"/>
+              <w:jc w:val="left"/>
+            </w:pPr>
+            <w:r>
+              <w:t xml:space="preserve">Alívio materno-fetal</w:t>
+            </w:r>
+          </w:p>
+        </w:tc>
+        <w:tc>
+          <w:p>
+            <w:pPr>
+              <w:pStyle w:val="Compact"/>
+              <w:jc w:val="left"/>
+            </w:pPr>
+            <w:r>
+              <w:t xml:space="preserve">62</w:t>
+            </w:r>
+          </w:p>
+        </w:tc>
+        <w:tc>
+          <w:p>
+            <w:pPr>
+              <w:pStyle w:val="Compact"/>
+              <w:jc w:val="left"/>
+            </w:pPr>
+            <w:r>
+              <w:t xml:space="preserve">17,1</w:t>
+            </w:r>
+          </w:p>
+        </w:tc>
+      </w:tr>
+      <w:tr>
+        <w:tc>
+          <w:p>
+            <w:pPr>
+              <w:pStyle w:val="Compact"/>
+              <w:jc w:val="left"/>
+            </w:pPr>
+            <w:r>
+              <w:t xml:space="preserve">Adolescentes</w:t>
+            </w:r>
+          </w:p>
+        </w:tc>
+        <w:tc>
+          <w:p>
+            <w:pPr>
+              <w:pStyle w:val="Compact"/>
+              <w:jc w:val="left"/>
+            </w:pPr>
+            <w:r>
+              <w:t xml:space="preserve">Abreviação do período expulsivo</w:t>
+            </w:r>
+          </w:p>
+        </w:tc>
+        <w:tc>
+          <w:p>
+            <w:pPr>
+              <w:pStyle w:val="Compact"/>
+              <w:jc w:val="left"/>
+            </w:pPr>
+            <w:r>
+              <w:t xml:space="preserve">41</w:t>
+            </w:r>
+          </w:p>
+        </w:tc>
+        <w:tc>
+          <w:p>
+            <w:pPr>
+              <w:pStyle w:val="Compact"/>
+              <w:jc w:val="left"/>
+            </w:pPr>
+            <w:r>
+              <w:t xml:space="preserve">11,3</w:t>
+            </w:r>
+          </w:p>
+        </w:tc>
+      </w:tr>
+      <w:tr>
+        <w:tc>
+          <w:p>
+            <w:pPr>
+              <w:pStyle w:val="Compact"/>
+              <w:jc w:val="left"/>
+            </w:pPr>
+            <w:r>
+              <w:t xml:space="preserve">Adolescentes</w:t>
+            </w:r>
+          </w:p>
+        </w:tc>
+        <w:tc>
+          <w:p>
+            <w:pPr>
+              <w:pStyle w:val="Compact"/>
+              <w:jc w:val="left"/>
+            </w:pPr>
+            <w:r>
+              <w:t xml:space="preserve">Distocia de rotação</w:t>
+            </w:r>
+          </w:p>
+        </w:tc>
+        <w:tc>
+          <w:p>
+            <w:pPr>
+              <w:pStyle w:val="Compact"/>
+              <w:jc w:val="left"/>
+            </w:pPr>
+            <w:r>
+              <w:t xml:space="preserve">36</w:t>
+            </w:r>
+          </w:p>
+        </w:tc>
+        <w:tc>
+          <w:p>
+            <w:pPr>
+              <w:pStyle w:val="Compact"/>
+              <w:jc w:val="left"/>
+            </w:pPr>
+            <w:r>
+              <w:t xml:space="preserve">9,9</w:t>
+            </w:r>
+          </w:p>
+        </w:tc>
+      </w:tr>
+      <w:tr>
+        <w:tc>
+          <w:p>
+            <w:pPr>
+              <w:pStyle w:val="Compact"/>
+              <w:jc w:val="left"/>
+            </w:pPr>
+            <w:r>
+              <w:t xml:space="preserve">Adolescentes</w:t>
+            </w:r>
+          </w:p>
+        </w:tc>
+        <w:tc>
+          <w:p>
+            <w:pPr>
+              <w:pStyle w:val="Compact"/>
+              <w:jc w:val="left"/>
+            </w:pPr>
+            <w:r>
+              <w:t xml:space="preserve">Mecônio</w:t>
+            </w:r>
+          </w:p>
+        </w:tc>
+        <w:tc>
+          <w:p>
+            <w:pPr>
+              <w:pStyle w:val="Compact"/>
+              <w:jc w:val="left"/>
+            </w:pPr>
+            <w:r>
+              <w:t xml:space="preserve">4</w:t>
+            </w:r>
+          </w:p>
+        </w:tc>
+        <w:tc>
+          <w:p>
+            <w:pPr>
+              <w:pStyle w:val="Compact"/>
+              <w:jc w:val="left"/>
+            </w:pPr>
+            <w:r>
+              <w:t xml:space="preserve">1,1</w:t>
+            </w:r>
+          </w:p>
+        </w:tc>
+      </w:tr>
+      <w:tr>
+        <w:tc>
+          <w:p>
+            <w:pPr>
+              <w:pStyle w:val="Compact"/>
+              <w:jc w:val="left"/>
+            </w:pPr>
+            <w:r>
+              <w:t xml:space="preserve">Adultas</w:t>
+            </w:r>
+          </w:p>
+        </w:tc>
+        <w:tc>
+          <w:p>
+            <w:pPr>
+              <w:pStyle w:val="Compact"/>
+              <w:jc w:val="left"/>
+            </w:pPr>
+            <w:r>
+              <w:t xml:space="preserve">Alívio materno-fetal</w:t>
+            </w:r>
+          </w:p>
+        </w:tc>
+        <w:tc>
+          <w:p>
+            <w:pPr>
+              <w:pStyle w:val="Compact"/>
+              <w:jc w:val="left"/>
+            </w:pPr>
+            <w:r>
+              <w:t xml:space="preserve">208</w:t>
+            </w:r>
+          </w:p>
+        </w:tc>
+        <w:tc>
+          <w:p>
+            <w:pPr>
+              <w:pStyle w:val="Compact"/>
+              <w:jc w:val="left"/>
+            </w:pPr>
+            <w:r>
+              <w:t xml:space="preserve">38,2</w:t>
+            </w:r>
+          </w:p>
+        </w:tc>
+      </w:tr>
+      <w:tr>
+        <w:tc>
+          <w:p>
+            <w:pPr>
+              <w:pStyle w:val="Compact"/>
+              <w:jc w:val="left"/>
+            </w:pPr>
+            <w:r>
+              <w:t xml:space="preserve">Adultas</w:t>
+            </w:r>
+          </w:p>
+        </w:tc>
+        <w:tc>
+          <w:p>
+            <w:pPr>
+              <w:pStyle w:val="Compact"/>
+              <w:jc w:val="left"/>
+            </w:pPr>
+            <w:r>
+              <w:t xml:space="preserve">Abreviação do período expulsivo</w:t>
+            </w:r>
+          </w:p>
+        </w:tc>
+        <w:tc>
+          <w:p>
+            <w:pPr>
+              <w:pStyle w:val="Compact"/>
+              <w:jc w:val="left"/>
+            </w:pPr>
+            <w:r>
+              <w:t xml:space="preserve">177</w:t>
+            </w:r>
+          </w:p>
+        </w:tc>
+        <w:tc>
+          <w:p>
+            <w:pPr>
+              <w:pStyle w:val="Compact"/>
+              <w:jc w:val="left"/>
+            </w:pPr>
+            <w:r>
+              <w:t xml:space="preserve">32,5</w:t>
+            </w:r>
+          </w:p>
+        </w:tc>
+      </w:tr>
+      <w:tr>
+        <w:tc>
+          <w:p>
+            <w:pPr>
+              <w:pStyle w:val="Compact"/>
+              <w:jc w:val="left"/>
+            </w:pPr>
+            <w:r>
+              <w:t xml:space="preserve">Adultas</w:t>
+            </w:r>
+          </w:p>
+        </w:tc>
+        <w:tc>
+          <w:p>
+            <w:pPr>
+              <w:pStyle w:val="Compact"/>
+              <w:jc w:val="left"/>
+            </w:pPr>
+            <w:r>
+              <w:t xml:space="preserve">Distocia de rotação</w:t>
+            </w:r>
+          </w:p>
+        </w:tc>
+        <w:tc>
+          <w:p>
+            <w:pPr>
+              <w:pStyle w:val="Compact"/>
+              <w:jc w:val="left"/>
+            </w:pPr>
+            <w:r>
+              <w:t xml:space="preserve">95</w:t>
+            </w:r>
+          </w:p>
+        </w:tc>
+        <w:tc>
+          <w:p>
+            <w:pPr>
+              <w:pStyle w:val="Compact"/>
+              <w:jc w:val="left"/>
+            </w:pPr>
+            <w:r>
+              <w:t xml:space="preserve">17,5</w:t>
+            </w:r>
+          </w:p>
+        </w:tc>
+      </w:tr>
+      <w:tr>
+        <w:tc>
+          <w:p>
+            <w:pPr>
+              <w:pStyle w:val="Compact"/>
+              <w:jc w:val="left"/>
+            </w:pPr>
+            <w:r>
+              <w:t xml:space="preserve">Adultas</w:t>
+            </w:r>
+          </w:p>
+        </w:tc>
+        <w:tc>
+          <w:p>
+            <w:pPr>
+              <w:pStyle w:val="Compact"/>
+              <w:jc w:val="left"/>
+            </w:pPr>
+            <w:r>
+              <w:t xml:space="preserve">Não informada</w:t>
+            </w:r>
+          </w:p>
+        </w:tc>
+        <w:tc>
+          <w:p>
+            <w:pPr>
+              <w:pStyle w:val="Compact"/>
+              <w:jc w:val="left"/>
+            </w:pPr>
+            <w:r>
+              <w:t xml:space="preserve">37</w:t>
+            </w:r>
+          </w:p>
+        </w:tc>
+        <w:tc>
+          <w:p>
+            <w:pPr>
+              <w:pStyle w:val="Compact"/>
+              <w:jc w:val="left"/>
+            </w:pPr>
+            <w:r>
+              <w:t xml:space="preserve">6,8</w:t>
+            </w:r>
+          </w:p>
+        </w:tc>
+      </w:tr>
+      <w:tr>
+        <w:tc>
+          <w:p>
+            <w:pPr>
+              <w:pStyle w:val="Compact"/>
+              <w:jc w:val="left"/>
+            </w:pPr>
+            <w:r>
+              <w:t xml:space="preserve">Adultas</w:t>
+            </w:r>
+          </w:p>
+        </w:tc>
+        <w:tc>
+          <w:p>
+            <w:pPr>
+              <w:pStyle w:val="Compact"/>
+              <w:jc w:val="left"/>
+            </w:pPr>
+            <w:r>
+              <w:t xml:space="preserve">Sofrimento fetal</w:t>
+            </w:r>
+          </w:p>
+        </w:tc>
+        <w:tc>
+          <w:p>
+            <w:pPr>
+              <w:pStyle w:val="Compact"/>
+              <w:jc w:val="left"/>
+            </w:pPr>
+            <w:r>
+              <w:t xml:space="preserve">10</w:t>
+            </w:r>
+          </w:p>
+        </w:tc>
+        <w:tc>
+          <w:p>
+            <w:pPr>
+              <w:pStyle w:val="Compact"/>
+              <w:jc w:val="left"/>
+            </w:pPr>
+            <w:r>
+              <w:t xml:space="preserve">1,8</w:t>
+            </w:r>
+          </w:p>
+        </w:tc>
+      </w:tr>
+    </w:tbl>
+    <w:p>
+      <w:pPr>
+        <w:pStyle w:val="BlockText"/>
+      </w:pPr>
+      <w:r>
+        <w:t xml:space="preserve">⚠️</w:t>
+      </w:r>
+      <w:r>
+        <w:t xml:space="preserve"> </w:t>
+      </w:r>
+      <w:r>
+        <w:rPr>
+          <w:b/>
+        </w:rPr>
+        <w:t xml:space="preserve">Limitação a registrar:</w:t>
+      </w:r>
+      <w:r>
+        <w:t xml:space="preserve"> </w:t>
+      </w:r>
+      <w:r>
+        <w:t xml:space="preserve">o fórcipe nas adolescentes tem</w:t>
+      </w:r>
+      <w:r>
+        <w:t xml:space="preserve"> </w:t>
+      </w:r>
+      <w:r>
+        <w:rPr>
+          <w:b/>
+        </w:rPr>
+        <w:t xml:space="preserve">59,5% de indicação não</w:t>
+      </w:r>
+      <w:r>
+        <w:rPr>
+          <w:b/>
+        </w:rPr>
+        <w:t xml:space="preserve"> </w:t>
+      </w:r>
+      <w:r>
+        <w:rPr>
+          <w:b/>
+        </w:rPr>
+        <w:t xml:space="preserve">informada</w:t>
+      </w:r>
+      <w:r>
+        <w:t xml:space="preserve"> </w:t>
+      </w:r>
+      <w:r>
+        <w:t xml:space="preserve">(216 de 363). Isso precisa ser dito no texto — a leitura das indicações de</w:t>
+      </w:r>
+      <w:r>
+        <w:t xml:space="preserve"> </w:t>
+      </w:r>
+      <w:r>
+        <w:t xml:space="preserve">fórcipe nesse grupo é parcial. Diferente da cesárea, o fórcipe não dispõe da</w:t>
+      </w:r>
+      <w:r>
+        <w:t xml:space="preserve"> </w:t>
+      </w:r>
+      <w:r>
+        <w:t xml:space="preserve">classificação</w:t>
+      </w:r>
+      <w:r>
+        <w:t xml:space="preserve"> </w:t>
+      </w:r>
+      <w:r>
+        <w:rPr>
+          <w:rStyle w:val="VerbatimChar"/>
+        </w:rPr>
+        <w:t xml:space="preserve">Indicacao_final</w:t>
+      </w:r>
+      <w:r>
+        <w:t xml:space="preserve"> </w:t>
+      </w:r>
+      <w:r>
+        <w:t xml:space="preserve">para recuperar esses motivos.</w:t>
+      </w:r>
+    </w:p>
+    <w:p>
+      <w:pPr>
+        <w:pStyle w:val="Heading3"/>
+      </w:pPr>
+      <w:bookmarkStart w:id="47" w:name="figuras-regeneradas"/>
+      <w:r>
+        <w:t xml:space="preserve">8.3 Figuras (regeneradas)</w:t>
+      </w:r>
+      <w:bookmarkEnd w:id="47"/>
+    </w:p>
+    <w:p>
+      <w:pPr>
+        <w:pStyle w:val="FirstParagraph"/>
+      </w:pPr>
+      <w:r>
+        <w:rPr>
+          <w:rStyle w:val="VerbatimChar"/>
+        </w:rPr>
+        <w:t xml:space="preserve">results/figures/fig_obj3_indicacoes_cesarea.png</w:t>
+      </w:r>
+      <w:r>
+        <w:t xml:space="preserve"> </w:t>
+      </w:r>
+      <w:r>
+        <w:t xml:space="preserve">e</w:t>
+      </w:r>
+      <w:r>
+        <w:t xml:space="preserve"> </w:t>
+      </w:r>
+      <w:r>
+        <w:rPr>
+          <w:rStyle w:val="VerbatimChar"/>
+        </w:rPr>
+        <w:t xml:space="preserve">fig_obj3_indicacoes_forcipe.png</w:t>
+      </w:r>
+      <w:r>
+        <w:t xml:space="preserve"> </w:t>
+      </w:r>
+      <w:r>
+        <w:t xml:space="preserve">foram regeradas (barras horizontais, dodge por grupo etário; vermelho = adolescentes,</w:t>
+      </w:r>
+      <w:r>
+        <w:t xml:space="preserve"> </w:t>
+      </w:r>
+      <w:r>
+        <w:t xml:space="preserve">verde-azulado = adultas). Substituir as imagens das Figuras 5 e 6 da dissertação.</w:t>
+      </w:r>
+    </w:p>
+    <w:p>
+      <w:pPr>
+        <w:pStyle w:val="Heading3"/>
+      </w:pPr>
+      <w:bookmarkStart w:id="48" w:name="texto-de-resultados-sugestões"/>
+      <w:r>
+        <w:t xml:space="preserve">8.4 Texto de resultados — sugestões</w:t>
+      </w:r>
+      <w:bookmarkEnd w:id="48"/>
+    </w:p>
+    <w:p>
+      <w:pPr>
+        <w:pStyle w:val="FirstParagraph"/>
+      </w:pPr>
+      <w:r>
+        <w:rPr>
+          <w:b/>
+        </w:rPr>
+        <w:t xml:space="preserve">5.4.1 Cesárea:</w:t>
+      </w:r>
+      <w:r>
+        <w:t xml:space="preserve"> </w:t>
+      </w:r>
+      <w:r>
+        <w:t xml:space="preserve">“</w:t>
+      </w:r>
+      <w:r>
+        <w:t xml:space="preserve">Entre as adolescentes, as principais indicações de cesárea foram</w:t>
+      </w:r>
+      <w:r>
+        <w:t xml:space="preserve"> </w:t>
+      </w:r>
+      <w:r>
+        <w:t xml:space="preserve">sofrimento fetal (28,2%), distocia funcional (18,0%), desproporção céfalo-pélvica</w:t>
+      </w:r>
+      <w:r>
+        <w:t xml:space="preserve"> </w:t>
+      </w:r>
+      <w:r>
+        <w:t xml:space="preserve">(16,9%) e apresentação pélvica (7,6%). Entre as adultas predominaram sofrimento fetal</w:t>
+      </w:r>
+      <w:r>
+        <w:t xml:space="preserve"> </w:t>
+      </w:r>
+      <w:r>
+        <w:t xml:space="preserve">(22,0%), patologia materna (14,7%), distocia funcional (12,1%), iteratividade (11,2%) e</w:t>
+      </w:r>
+      <w:r>
+        <w:t xml:space="preserve"> </w:t>
+      </w:r>
+      <w:r>
+        <w:t xml:space="preserve">contraindicação de indução (10,3%). Destacam-se, nas adultas, a</w:t>
+      </w:r>
+      <w:r>
+        <w:t xml:space="preserve"> </w:t>
+      </w:r>
+      <w:r>
+        <w:rPr>
+          <w:b/>
+        </w:rPr>
+        <w:t xml:space="preserve">iteratividade</w:t>
+      </w:r>
+      <w:r>
+        <w:t xml:space="preserve"> </w:t>
+      </w:r>
+      <w:r>
+        <w:t xml:space="preserve">e a</w:t>
+      </w:r>
+      <w:r>
+        <w:t xml:space="preserve"> </w:t>
+      </w:r>
+      <w:r>
+        <w:rPr>
+          <w:b/>
+        </w:rPr>
+        <w:t xml:space="preserve">patologia materna</w:t>
+      </w:r>
+      <w:r>
+        <w:t xml:space="preserve"> </w:t>
+      </w:r>
+      <w:r>
+        <w:t xml:space="preserve">— praticamente ausentes entre as adolescentes —, coerentes com o</w:t>
+      </w:r>
+      <w:r>
+        <w:t xml:space="preserve"> </w:t>
+      </w:r>
+      <w:r>
+        <w:t xml:space="preserve">maior número de cesáreas prévias e de comorbidades nesse grupo. A desproporção</w:t>
+      </w:r>
+      <w:r>
+        <w:t xml:space="preserve"> </w:t>
+      </w:r>
+      <w:r>
+        <w:t xml:space="preserve">céfalo-pélvica e a apresentação pélvica tiveram peso proporcionalmente maior entre as</w:t>
+      </w:r>
+      <w:r>
+        <w:t xml:space="preserve"> </w:t>
+      </w:r>
+      <w:r>
+        <w:t xml:space="preserve">adolescentes.</w:t>
+      </w:r>
+      <w:r>
+        <w:t xml:space="preserve">”</w:t>
+      </w:r>
+    </w:p>
+    <w:p>
+      <w:pPr>
+        <w:pStyle w:val="BodyText"/>
+      </w:pPr>
+      <w:r>
+        <w:rPr>
+          <w:b/>
+        </w:rPr>
+        <w:t xml:space="preserve">5.4.2 Fórcipe:</w:t>
+      </w:r>
+      <w:r>
+        <w:t xml:space="preserve"> </w:t>
+      </w:r>
+      <w:r>
+        <w:t xml:space="preserve">“</w:t>
+      </w:r>
+      <w:r>
+        <w:t xml:space="preserve">Entre as adultas, as indicações de fórcipe foram majoritariamente o</w:t>
+      </w:r>
+      <w:r>
+        <w:t xml:space="preserve"> </w:t>
+      </w:r>
+      <w:r>
+        <w:t xml:space="preserve">alívio materno-fetal (38,2%) e a abreviação do período expulsivo (32,5%), seguidas de</w:t>
+      </w:r>
+      <w:r>
+        <w:t xml:space="preserve"> </w:t>
+      </w:r>
+      <w:r>
+        <w:t xml:space="preserve">distocia de rotação (17,5%). O mesmo padrão apareceu nas adolescentes (alívio</w:t>
+      </w:r>
+      <w:r>
+        <w:t xml:space="preserve"> </w:t>
+      </w:r>
+      <w:r>
+        <w:t xml:space="preserve">materno-fetal 17,1%; abreviação do período expulsivo 11,3%; distocia de rotação 9,9%),</w:t>
+      </w:r>
+      <w:r>
+        <w:t xml:space="preserve"> </w:t>
+      </w:r>
+      <w:r>
+        <w:t xml:space="preserve">embora a maioria dos fórcipes nesse grupo não tivesse a indicação registrada (59,5%), o</w:t>
+      </w:r>
+      <w:r>
+        <w:t xml:space="preserve"> </w:t>
+      </w:r>
+      <w:r>
+        <w:t xml:space="preserve">que limita a interpretação.</w:t>
+      </w:r>
+      <w:r>
+        <w:t xml:space="preserve">”</w:t>
+      </w:r>
+    </w:p>
+    <w:p>
+      <w:pPr>
+        <w:pStyle w:val="Heading3"/>
+      </w:pPr>
+      <w:bookmarkStart w:id="49" w:name="checklist-da-seção-5.4"/>
+      <w:r>
+        <w:t xml:space="preserve">8.5 Checklist da Seção 5.4</w:t>
+      </w:r>
+      <w:bookmarkEnd w:id="49"/>
+    </w:p>
+    <w:p>
+      <w:pPr>
+        <w:numPr>
+          <w:ilvl w:val="0"/>
+          <w:numId w:val="1012"/>
+        </w:numPr>
+        <w:pStyle w:val="Compact"/>
+      </w:pPr>
+      <w:r>
+        <w:t xml:space="preserve">☐ Substituir a Tabela 8 (cesárea) pela versão baseada em</w:t>
+      </w:r>
+      <w:r>
+        <w:t xml:space="preserve"> </w:t>
+      </w:r>
+      <w:r>
+        <w:rPr>
+          <w:rStyle w:val="VerbatimChar"/>
+        </w:rPr>
+        <w:t xml:space="preserve">Indicacao_final</w:t>
+      </w:r>
+      <w:r>
+        <w:t xml:space="preserve">.</w:t>
+      </w:r>
+    </w:p>
+    <w:p>
+      <w:pPr>
+        <w:numPr>
+          <w:ilvl w:val="0"/>
+          <w:numId w:val="1012"/>
+        </w:numPr>
+        <w:pStyle w:val="Compact"/>
+      </w:pPr>
+      <w:r>
+        <w:t xml:space="preserve">☐ Atualizar a Tabela 9 (fórcipe) com os valores recalculados na coorte unificada.</w:t>
+      </w:r>
+    </w:p>
+    <w:p>
+      <w:pPr>
+        <w:numPr>
+          <w:ilvl w:val="0"/>
+          <w:numId w:val="1012"/>
+        </w:numPr>
+        <w:pStyle w:val="Compact"/>
+      </w:pPr>
+      <w:r>
+        <w:t xml:space="preserve">☐ Trocar as Figuras 5 e 6 pelas novas (</w:t>
+      </w:r>
+      <w:r>
+        <w:rPr>
+          <w:rStyle w:val="VerbatimChar"/>
+        </w:rPr>
+        <w:t xml:space="preserve">fig_obj3_*</w:t>
+      </w:r>
+      <w:r>
+        <w:t xml:space="preserve">).</w:t>
+      </w:r>
+    </w:p>
+    <w:p>
+      <w:pPr>
+        <w:numPr>
+          <w:ilvl w:val="0"/>
+          <w:numId w:val="1012"/>
+        </w:numPr>
+        <w:pStyle w:val="Compact"/>
+      </w:pPr>
+      <w:r>
+        <w:t xml:space="preserve">☐ Acrescentar a frase de método (uso de</w:t>
+      </w:r>
+      <w:r>
+        <w:t xml:space="preserve"> </w:t>
+      </w:r>
+      <w:r>
+        <w:rPr>
+          <w:rStyle w:val="VerbatimChar"/>
+        </w:rPr>
+        <w:t xml:space="preserve">Indicacao_final</w:t>
+      </w:r>
+      <w:r>
+        <w:t xml:space="preserve"> </w:t>
+      </w:r>
+      <w:r>
+        <w:t xml:space="preserve">+ união por RGHC).</w:t>
+      </w:r>
+    </w:p>
+    <w:p>
+      <w:pPr>
+        <w:numPr>
+          <w:ilvl w:val="0"/>
+          <w:numId w:val="1012"/>
+        </w:numPr>
+        <w:pStyle w:val="Compact"/>
+      </w:pPr>
+      <w:r>
+        <w:t xml:space="preserve">☐ Registrar a limitação do alto % de fórcipe sem indicação nas adolescentes.</w:t>
+      </w:r>
+    </w:p>
+    <w:p>
+      <w:pPr>
+        <w:numPr>
+          <w:ilvl w:val="0"/>
+          <w:numId w:val="1012"/>
+        </w:numPr>
+        <w:pStyle w:val="Compact"/>
+      </w:pPr>
+      <w:r>
+        <w:t xml:space="preserve">☐ Reescrever os parágrafos de 5.4.1 e 5.4.2 (sugestões acima).</w:t>
+      </w:r>
+    </w:p>
     <w:sectPr/>
   </w:body>
 </w:document>
@@ -7296,6 +9436,9 @@
     <w:abstractNumId w:val="991"/>
   </w:num>
   <w:num w:numId="1011">
+    <w:abstractNumId w:val="991"/>
+  </w:num>
+  <w:num w:numId="1012">
     <w:abstractNumId w:val="991"/>
   </w:num>
 </w:numbering>

</xml_diff>